<commit_message>
11 va 18-mavzu: imlo tuzatildi, testlar qayta yozildi
- Orfografik xatolar (JSHODS → JShDS, oydagikichik, FIKLASH, KEYSI,
  Unig, tan narx, kassan va b.) tuzatildi
- 40 ta test qayta yozildi: variantlar 5 so'zdan oshmaydi, uzunligi
  deyarli bir xil, chalg'ituvchilar haqiqiy buxgalteriya xatolariga
  asoslangan, to'g'ri javob o'rni A–D bo'yicha tasodifiy
- Javoblar kalitiga har bir savol uchun batafsil tushuntirish qo'shildi
- 18: avans to'lash testi masaladagi provodkaga moslandi (Dt 4210 Kt 5110)
- 11: QQS testi masaladagi usulga moslandi (Dt 4010 Kt 6410); masala
  yechimiga yo'q bo'lgan 5-operatsiya (Dt 9420 Kt 4210) qo'shildi

Co-Authored-By: Claude Opus 5.5 <noreply@anthropic.com>
Claude-Session: https://claude.ai/code/session_01A8udND8c2uT8wcDmL4isj2
</commit_message>
<xml_diff>
--- a/vazifalar/docx/11 debitorlar-hisobi-vazifalar yechimi.docx
+++ b/vazifalar/docx/11 debitorlar-hisobi-vazifalar yechimi.docx
@@ -72,7 +72,7 @@
               <w:rPr>
                 <w:sz w:val="19"/>
               </w:rPr>
-              <w:t xml:space="preserve">21-son BHMS (Schyotlar rejasi), Fuqarolik Kodeksi (150-modda), Soliq Kodeksi va amaldagi </w:t>
+              <w:t xml:space="preserve">21-son BHMS (Schyotlar rejasi), Fuqarolik kodeksi (150-modda), Soliq kodeksi va amaldagi </w:t>
             </w:r>
             <w:r>
               <w:rPr>
@@ -101,7 +101,7 @@
           <w:color w:val="1F4E79"/>
           <w:sz w:val="28"/>
         </w:rPr>
-        <w:t>1-QISM: VAZIFALAR VA MASHQLAR (Talabalar yechishi uchun)</w:t>
+        <w:t>1-QISM: VAZIFALAR VA MASHQLAR (talabalar yechishi uchun)</w:t>
       </w:r>
     </w:p>
     <w:p>
@@ -116,7 +116,7 @@
           <w:color w:val="2E75B6"/>
           <w:sz w:val="24"/>
         </w:rPr>
-        <w:t>1. Ko'rgazmali masala (Kompleks amaliy topshiriq)</w:t>
+        <w:t>1. Ko'rgazmali masala (kompleks amaliy topshiriq)</w:t>
       </w:r>
     </w:p>
     <w:p>
@@ -151,7 +151,7 @@
         <w:t>Xaridor 'Alfa' MChJga tayyor mahsulot sotildi. Shartnoma qiymati QQS (</w:t>
       </w:r>
       <w:r>
-        <w:t>12%) bilan birga 56 000 000 so'm (shundan mahsulot qiymati 50 000 000 so'm, QQS 6 000 000 so'm). Tan narxi 38 000 000 so'm.</w:t>
+        <w:t>12%) bilan birga 56 000 000 so'm (shundan mahsulot qiymati 50 000 000 so'm, QQS 6 000 000 so'm). Tannarxi 38 000 000 so'm.</w:t>
       </w:r>
     </w:p>
     <w:p>
@@ -293,7 +293,7 @@
         <w:rPr>
           <w:i/>
         </w:rPr>
-        <w:t>ob variantini tanlang (variantlar qisqa va londa berilgan):</w:t>
+        <w:t>ob variantini tanlang (variantlar qisqa va lo'nda berilgan):</w:t>
       </w:r>
     </w:p>
     <w:p>
@@ -313,7 +313,7 @@
         <w:ind w:left="288"/>
       </w:pPr>
       <w:r>
-        <w:t>A) Korxonaning boshqa shaxslarga qarzi</w:t>
+        <w:t>A) Boshqalarning korxonaga bo'lgan qarzi</w:t>
       </w:r>
     </w:p>
     <w:p>
@@ -322,7 +322,7 @@
         <w:ind w:left="288"/>
       </w:pPr>
       <w:r>
-        <w:t>B) Boshqa shaxslarning korxonaga qarzi</w:t>
+        <w:t>B) Korxonaning boshqalarga bo'lgan qarzi</w:t>
       </w:r>
     </w:p>
     <w:p>
@@ -331,8 +331,7 @@
         <w:ind w:left="288"/>
       </w:pPr>
       <w:r>
-        <w:lastRenderedPageBreak/>
-        <w:t>C) Faqat bank kreditlari summasi</w:t>
+        <w:t>C) Korxonaga berilgan bank krediti</w:t>
       </w:r>
     </w:p>
     <w:p>
@@ -341,7 +340,7 @@
         <w:ind w:left="288"/>
       </w:pPr>
       <w:r>
-        <w:t>D) Korxonaning sof foydasi</w:t>
+        <w:t>D) Kelgusi davr xarajatlari summasi</w:t>
       </w:r>
     </w:p>
     <w:p>
@@ -367,7 +366,7 @@
         <w:ind w:left="288"/>
       </w:pPr>
       <w:r>
-        <w:t>A) 5110</w:t>
+        <w:t>A) 9010-schyot</w:t>
       </w:r>
     </w:p>
     <w:p>
@@ -376,7 +375,7 @@
         <w:ind w:left="288"/>
       </w:pPr>
       <w:r>
-        <w:t>B) 6010</w:t>
+        <w:t>B) 6010-schyot</w:t>
       </w:r>
     </w:p>
     <w:p>
@@ -385,7 +384,7 @@
         <w:ind w:left="288"/>
       </w:pPr>
       <w:r>
-        <w:t>C) 4010</w:t>
+        <w:t>C) 4310-schyot</w:t>
       </w:r>
     </w:p>
     <w:p>
@@ -394,7 +393,7 @@
         <w:ind w:left="288"/>
       </w:pPr>
       <w:r>
-        <w:t>D) 9010</w:t>
+        <w:t>D) 4010-schyot</w:t>
       </w:r>
     </w:p>
     <w:p>
@@ -414,7 +413,7 @@
         <w:ind w:left="288"/>
       </w:pPr>
       <w:r>
-        <w:t>A) 4010</w:t>
+        <w:t>A) 6310-schyot</w:t>
       </w:r>
     </w:p>
     <w:p>
@@ -423,7 +422,7 @@
         <w:ind w:left="288"/>
       </w:pPr>
       <w:r>
-        <w:t>B) 4310</w:t>
+        <w:t>B) 4310-schyot</w:t>
       </w:r>
     </w:p>
     <w:p>
@@ -432,7 +431,7 @@
         <w:ind w:left="288"/>
       </w:pPr>
       <w:r>
-        <w:t>C) 6010</w:t>
+        <w:t>C) 4010-schyot</w:t>
       </w:r>
     </w:p>
     <w:p>
@@ -441,7 +440,7 @@
         <w:ind w:left="288"/>
       </w:pPr>
       <w:r>
-        <w:t>D) 6310</w:t>
+        <w:t>D) 6010-schyot</w:t>
       </w:r>
     </w:p>
     <w:p>
@@ -452,7 +451,7 @@
         <w:rPr>
           <w:b/>
         </w:rPr>
-        <w:t xml:space="preserve">4. O'zbekiston Respublikasi Fuqarolik Kodeksiga ko'ra </w:t>
+        <w:t xml:space="preserve">4. O'zbekiston Respublikasi Fuqarolik kodeksiga ko'ra </w:t>
       </w:r>
       <w:r>
         <w:rPr>
@@ -467,7 +466,7 @@
         <w:ind w:left="288"/>
       </w:pPr>
       <w:r>
-        <w:t>A) 1 yil</w:t>
+        <w:t>A) Bir yil</w:t>
       </w:r>
     </w:p>
     <w:p>
@@ -476,7 +475,7 @@
         <w:ind w:left="288"/>
       </w:pPr>
       <w:r>
-        <w:t>B) 2 yil</w:t>
+        <w:t>B) Besh yil</w:t>
       </w:r>
     </w:p>
     <w:p>
@@ -485,7 +484,7 @@
         <w:ind w:left="288"/>
       </w:pPr>
       <w:r>
-        <w:t>C) 3 yil</w:t>
+        <w:t>C) Uch yil</w:t>
       </w:r>
     </w:p>
     <w:p>
@@ -494,7 +493,7 @@
         <w:ind w:left="288"/>
       </w:pPr>
       <w:r>
-        <w:t>D) 5 yil</w:t>
+        <w:t>D) O'n yil</w:t>
       </w:r>
     </w:p>
     <w:p>
@@ -514,7 +513,7 @@
         <w:ind w:left="288"/>
       </w:pPr>
       <w:r>
-        <w:t>A) 4910</w:t>
+        <w:t>A) 8910-schyot</w:t>
       </w:r>
     </w:p>
     <w:p>
@@ -523,7 +522,7 @@
         <w:ind w:left="288"/>
       </w:pPr>
       <w:r>
-        <w:t>B) 8330</w:t>
+        <w:t>B) 9430-schyot</w:t>
       </w:r>
     </w:p>
     <w:p>
@@ -532,7 +531,7 @@
         <w:ind w:left="288"/>
       </w:pPr>
       <w:r>
-        <w:t>C) 5910</w:t>
+        <w:t>C) 4010-schyot</w:t>
       </w:r>
     </w:p>
     <w:p>
@@ -541,7 +540,7 @@
         <w:ind w:left="288"/>
       </w:pPr>
       <w:r>
-        <w:t>D) 4010</w:t>
+        <w:t>D) 4910-schyot</w:t>
       </w:r>
     </w:p>
     <w:p>
@@ -567,7 +566,7 @@
         <w:ind w:left="288"/>
       </w:pPr>
       <w:r>
-        <w:t>A) 4010</w:t>
+        <w:t>A) 4710-schyot</w:t>
       </w:r>
     </w:p>
     <w:p>
@@ -576,7 +575,7 @@
         <w:ind w:left="288"/>
       </w:pPr>
       <w:r>
-        <w:t>B) 4210</w:t>
+        <w:t>B) 4210-schyot</w:t>
       </w:r>
     </w:p>
     <w:p>
@@ -585,7 +584,7 @@
         <w:ind w:left="288"/>
       </w:pPr>
       <w:r>
-        <w:t>C) 6710</w:t>
+        <w:t>C) 6710-schyot</w:t>
       </w:r>
     </w:p>
     <w:p>
@@ -594,7 +593,7 @@
         <w:ind w:left="288"/>
       </w:pPr>
       <w:r>
-        <w:t>D) 6910</w:t>
+        <w:t>D) 4310-schyot</w:t>
       </w:r>
     </w:p>
     <w:p>
@@ -614,7 +613,7 @@
         <w:ind w:left="288"/>
       </w:pPr>
       <w:r>
-        <w:t>A) 9410</w:t>
+        <w:t>A) 9430-schyot</w:t>
       </w:r>
     </w:p>
     <w:p>
@@ -623,7 +622,7 @@
         <w:ind w:left="288"/>
       </w:pPr>
       <w:r>
-        <w:t>B) 9420</w:t>
+        <w:t>B) 9420-schyot</w:t>
       </w:r>
     </w:p>
     <w:p>
@@ -632,7 +631,7 @@
         <w:ind w:left="288"/>
       </w:pPr>
       <w:r>
-        <w:t>C) 9430</w:t>
+        <w:t>C) 9910-schyot</w:t>
       </w:r>
     </w:p>
     <w:p>
@@ -641,7 +640,7 @@
         <w:ind w:left="288"/>
       </w:pPr>
       <w:r>
-        <w:t>D) 9910</w:t>
+        <w:t>D) 4910-schyot</w:t>
       </w:r>
     </w:p>
     <w:p>
@@ -667,7 +666,7 @@
         <w:ind w:left="288"/>
       </w:pPr>
       <w:r>
-        <w:t>A) Uzoq muddatli aktivlar</w:t>
+        <w:t>A) Uzoq muddatli aktivlarda</w:t>
       </w:r>
     </w:p>
     <w:p>
@@ -676,7 +675,7 @@
         <w:ind w:left="288"/>
       </w:pPr>
       <w:r>
-        <w:t>B) Joriy aktivlar</w:t>
+        <w:t>B) Joriy majburiyatlar bo'limida</w:t>
       </w:r>
     </w:p>
     <w:p>
@@ -685,7 +684,7 @@
         <w:ind w:left="288"/>
       </w:pPr>
       <w:r>
-        <w:t>C) Majburiyatlar</w:t>
+        <w:t>C) Joriy aktivlar bo'limida</w:t>
       </w:r>
     </w:p>
     <w:p>
@@ -694,7 +693,7 @@
         <w:ind w:left="288"/>
       </w:pPr>
       <w:r>
-        <w:t>D) Xususiy kapital</w:t>
+        <w:t>D) Xususiy kapital bo'limida</w:t>
       </w:r>
     </w:p>
     <w:p>
@@ -714,8 +713,7 @@
         <w:ind w:left="288"/>
       </w:pPr>
       <w:r>
-        <w:lastRenderedPageBreak/>
-        <w:t>A) Og'zaki kelishuv</w:t>
+        <w:t>A) Faqat rahbarning ichki buyrug'i</w:t>
       </w:r>
     </w:p>
     <w:p>
@@ -724,7 +722,7 @@
         <w:ind w:left="288"/>
       </w:pPr>
       <w:r>
-        <w:t>B) Sud yoki Davlat ijrochisi hujjati</w:t>
+        <w:t>B) Sud yoki davlat ijrochisi hujjati</w:t>
       </w:r>
     </w:p>
     <w:p>
@@ -733,11 +731,9 @@
         <w:ind w:left="288"/>
       </w:pPr>
       <w:r>
-        <w:t>C) Faqat ichk</w:t>
-      </w:r>
-      <w:r>
-        <w:t>i buyruq</w:t>
-      </w:r>
+        <w:t>C) Bank tomonidan berilgan ma'lumotnoma</w:t>
+      </w:r>
+      <w:r/>
     </w:p>
     <w:p>
       <w:pPr>
@@ -745,7 +741,7 @@
         <w:ind w:left="288"/>
       </w:pPr>
       <w:r>
-        <w:t>D) Bank ma'lumotnomasi</w:t>
+        <w:t>D) Xaridor bilan og'zaki kelishuv</w:t>
       </w:r>
     </w:p>
     <w:p>
@@ -756,7 +752,7 @@
         <w:rPr>
           <w:b/>
         </w:rPr>
-        <w:t>10. Solishtirish dalolatnomasi (Akt sverki) tuzilishi da'vo muddatiga qanday ta'sir qiladi?</w:t>
+        <w:t>10. Solishtirish dalolatnomasi (akt sverki) tuzilishi da'vo muddatiga qanday ta'sir qiladi?</w:t>
       </w:r>
     </w:p>
     <w:p>
@@ -765,7 +761,7 @@
         <w:ind w:left="288"/>
       </w:pPr>
       <w:r>
-        <w:t>A) Ta'sir qilmaydi</w:t>
+        <w:t>A) Da'vo muddatini bir yilga uzaytiradi</w:t>
       </w:r>
     </w:p>
     <w:p>
@@ -774,7 +770,7 @@
         <w:ind w:left="288"/>
       </w:pPr>
       <w:r>
-        <w:t>B) Da'vo muddatini uzib, qayta boshlaydi</w:t>
+        <w:t>B) Da'vo muddatiga hech ta'sir qilmaydi</w:t>
       </w:r>
     </w:p>
     <w:p>
@@ -783,7 +779,7 @@
         <w:ind w:left="288"/>
       </w:pPr>
       <w:r>
-        <w:t>C) Da'vo muddatini tugatadi</w:t>
+        <w:t>C) Qarzni hisobdan avtomatik chiqaradi</w:t>
       </w:r>
     </w:p>
     <w:p>
@@ -792,7 +788,7 @@
         <w:ind w:left="288"/>
       </w:pPr>
       <w:r>
-        <w:t>D) Qarzni bekor qiladi</w:t>
+        <w:t>D) Da'vo muddatini uzib, qayta boshlaydi</w:t>
       </w:r>
     </w:p>
     <w:p>
@@ -891,7 +887,7 @@
           <w:color w:val="2E75B6"/>
           <w:sz w:val="24"/>
         </w:rPr>
-        <w:t>va tezkor mashqlar (Atamalar mosligi va amaliy hisoblar)</w:t>
+        <w:t>va tezkor mashqlar (atamalar mosligi va amaliy hisoblar)</w:t>
       </w:r>
     </w:p>
     <w:p>
@@ -1189,7 +1185,7 @@
         <w:t xml:space="preserve">2-MASHQ (BHM bo'yicha hisob-kitob): </w:t>
       </w:r>
       <w:r>
-        <w:t>Ma'muriy javobgarlik to'g'risidagi Kodeksga muvofiq debitorlik qarzlarini o'z vaqtida undirmaslik va muddati o'tib ketishiga yo'l qo'yganligi uchun korxona mansabdor shaxsiga BHMning 10 baravari miqdo</w:t>
+        <w:t>Ma'muriy javobgarlik to'g'risidagi kodeksga muvofiq debitorlik qarzlarini o'z vaqtida undirmaslik va muddati o'tib ketishiga yo'l qo'yganligi uchun korxona mansabdor shaxsiga BHMning 10 baravari miqdo</w:t>
       </w:r>
       <w:r>
         <w:t>rida jarima solindi. Amaldagi BHM = 440 000 so'm bo'lsa, jarima summasini hisoblang.</w:t>
@@ -1223,7 +1219,7 @@
         <w:t xml:space="preserve">4-MASHQ (QQSli sotishda debitorlik): </w:t>
       </w:r>
       <w:r>
-        <w:t xml:space="preserve">Xaridorga 100 000 000 so'mlik mahsulot sotildi. Soliq Kodeksiga muvofiq QQS stavkasi 12% bo'lsa, xaridordan undirilishi lozim bo'lgan umumiy </w:t>
+        <w:t xml:space="preserve">Xaridorga 100 000 000 so'mlik mahsulot sotildi. Soliq kodeksiga muvofiq QQS stavkasi 12% bo'lsa, xaridordan undirilishi lozim bo'lgan umumiy </w:t>
       </w:r>
       <w:r>
         <w:t>debitorlik qarzi (4010) summasini hisoblang.</w:t>
@@ -1269,7 +1265,7 @@
         <w:t xml:space="preserve">1-MASALA (Mahsulot sotish va debitorlik hisobi): </w:t>
       </w:r>
       <w:r>
-        <w:t>'Omdor' MChJ xaridor 'Maks-Servis'ga 84 000 000 so'mlik (shundan QQS 12% — 9 000 000 so'm) tayyor mahsulot sotdi. Mahsulot tan narxi 60 000 000 so'm.</w:t>
+        <w:t>'Omdor' MChJ xaridor 'Maks-Servis'ga 84 000 000 so'mlik (shundan QQS 12% — 9 000 000 so'm) tayyor mahsulot sotdi. Mahsulot tannarxi 60 000 000 so'm.</w:t>
       </w:r>
       <w:r>
         <w:t xml:space="preserve"> Keyinchalik xaridor bank orqali 50 000 000 so'm to'ladi. Ushbu operatsiyalarni buxgalteriya o'tkazmalarida aks ettiring.</w:t>
@@ -1379,8 +1375,7 @@
           <w:color w:val="2E75B6"/>
           <w:sz w:val="24"/>
         </w:rPr>
-        <w:lastRenderedPageBreak/>
-        <w:t>7. O'z-o'zini tekshirish uchun testlar (Buxgalteriya o'tkazmalariga oid - 10 ta test)</w:t>
+        <w:t>7. O'z-o'zini tekshirish uchun testlar (buxgalteriya o'tkazmalariga oid — 10 ta test)</w:t>
       </w:r>
     </w:p>
     <w:p>
@@ -1400,7 +1395,7 @@
         <w:ind w:left="288"/>
       </w:pPr>
       <w:r>
-        <w:t>A) Dt 4010 - Kt 9010</w:t>
+        <w:t>A) Dt 9010 - Kt 4010</w:t>
       </w:r>
     </w:p>
     <w:p>
@@ -1409,11 +1404,9 @@
         <w:ind w:left="288"/>
       </w:pPr>
       <w:r>
-        <w:t>B) D</w:t>
-      </w:r>
-      <w:r>
-        <w:t>t 5110 - Kt 4010</w:t>
-      </w:r>
+        <w:t>B) Dt 5110 - Kt 9010</w:t>
+      </w:r>
+      <w:r/>
     </w:p>
     <w:p>
       <w:pPr>
@@ -1421,7 +1414,7 @@
         <w:ind w:left="288"/>
       </w:pPr>
       <w:r>
-        <w:t>C) Dt 9010 - Kt 4010</w:t>
+        <w:t>C) Dt 4010 - Kt 9010</w:t>
       </w:r>
     </w:p>
     <w:p>
@@ -1430,7 +1423,7 @@
         <w:ind w:left="288"/>
       </w:pPr>
       <w:r>
-        <w:t>D) Dt 4010 - Kt 5110</w:t>
+        <w:t>D) Dt 4010 - Kt 6010</w:t>
       </w:r>
     </w:p>
     <w:p>
@@ -1450,7 +1443,7 @@
         <w:ind w:left="288"/>
       </w:pPr>
       <w:r>
-        <w:t>A) Dt 4010 - Kt 5110</w:t>
+        <w:t>A) Dt 5110 - Kt 4010</w:t>
       </w:r>
     </w:p>
     <w:p>
@@ -1459,7 +1452,7 @@
         <w:ind w:left="288"/>
       </w:pPr>
       <w:r>
-        <w:t>B) Dt 5110 - Kt 4010</w:t>
+        <w:t>B) Dt 4010 - Kt 5110</w:t>
       </w:r>
     </w:p>
     <w:p>
@@ -1477,7 +1470,7 @@
         <w:ind w:left="288"/>
       </w:pPr>
       <w:r>
-        <w:t>D) Dt 6010 - Kt 5110</w:t>
+        <w:t>D) Dt 5110 - Kt 6310</w:t>
       </w:r>
     </w:p>
     <w:p>
@@ -1512,7 +1505,7 @@
         <w:ind w:left="288"/>
       </w:pPr>
       <w:r>
-        <w:t>B) Dt 4310 - Kt 5110</w:t>
+        <w:t>B) Dt 5110 - Kt 4310</w:t>
       </w:r>
     </w:p>
     <w:p>
@@ -1521,7 +1514,7 @@
         <w:ind w:left="288"/>
       </w:pPr>
       <w:r>
-        <w:t>C) Dt 5110 - Kt 4310</w:t>
+        <w:t>C) Dt 6310 - Kt 5110</w:t>
       </w:r>
     </w:p>
     <w:p>
@@ -1530,7 +1523,7 @@
         <w:ind w:left="288"/>
       </w:pPr>
       <w:r>
-        <w:t>D) Dt 1010 - Kt 4310</w:t>
+        <w:t>D) Dt 4310 - Kt 5110</w:t>
       </w:r>
     </w:p>
     <w:p>
@@ -1550,7 +1543,7 @@
         <w:ind w:left="288"/>
       </w:pPr>
       <w:r>
-        <w:t>A) Dt 6010 - Kt 4310</w:t>
+        <w:t>A) Dt 4310 - Kt 6010</w:t>
       </w:r>
     </w:p>
     <w:p>
@@ -1559,11 +1552,9 @@
         <w:ind w:left="288"/>
       </w:pPr>
       <w:r>
-        <w:t xml:space="preserve">B) Dt </w:t>
-      </w:r>
-      <w:r>
-        <w:t>4310 - Kt 6010</w:t>
-      </w:r>
+        <w:t>B) Dt 6010 - Kt 4310</w:t>
+      </w:r>
+      <w:r/>
     </w:p>
     <w:p>
       <w:pPr>
@@ -1571,7 +1562,7 @@
         <w:ind w:left="288"/>
       </w:pPr>
       <w:r>
-        <w:t>C) Dt 1010 - Kt 5110</w:t>
+        <w:t>C) Dt 1010 - Kt 4310</w:t>
       </w:r>
     </w:p>
     <w:p>
@@ -1580,7 +1571,7 @@
         <w:ind w:left="288"/>
       </w:pPr>
       <w:r>
-        <w:t>D) Dt 4010 - Kt 4310</w:t>
+        <w:t>D) Dt 6310 - Kt 4310</w:t>
       </w:r>
     </w:p>
     <w:p>
@@ -1618,7 +1609,7 @@
         <w:ind w:left="288"/>
       </w:pPr>
       <w:r>
-        <w:t>C) Dt 4010 - Kt 4910</w:t>
+        <w:t>C) Dt 9430 - Kt 4010</w:t>
       </w:r>
     </w:p>
     <w:p>
@@ -1627,7 +1618,7 @@
         <w:ind w:left="288"/>
       </w:pPr>
       <w:r>
-        <w:t>D) Dt 9430 - Kt 4010</w:t>
+        <w:t>D) Dt 4910 - Kt 4010</w:t>
       </w:r>
     </w:p>
     <w:p>
@@ -1662,7 +1653,7 @@
         <w:ind w:left="288"/>
       </w:pPr>
       <w:r>
-        <w:t>B) Dt 4910 - Kt 4010</w:t>
+        <w:t>B) Dt 4010 - Kt 4910</w:t>
       </w:r>
     </w:p>
     <w:p>
@@ -1671,7 +1662,7 @@
         <w:ind w:left="288"/>
       </w:pPr>
       <w:r>
-        <w:t>C) Dt 4010 - Kt 4910</w:t>
+        <w:t>C) Dt 4910 - Kt 4010</w:t>
       </w:r>
     </w:p>
     <w:p>
@@ -1680,7 +1671,7 @@
         <w:ind w:left="288"/>
       </w:pPr>
       <w:r>
-        <w:t>D) Dt 5110 - Kt 4910</w:t>
+        <w:t>D) Dt 9430 - Kt 4910</w:t>
       </w:r>
     </w:p>
     <w:p>
@@ -1700,7 +1691,7 @@
         <w:ind w:left="288"/>
       </w:pPr>
       <w:r>
-        <w:t>A) Dt 9430 - Kt 4010</w:t>
+        <w:t>A) Dt 4910 - Kt 4010</w:t>
       </w:r>
     </w:p>
     <w:p>
@@ -1709,7 +1700,7 @@
         <w:ind w:left="288"/>
       </w:pPr>
       <w:r>
-        <w:t>B) Dt 4010 - Kt 9430</w:t>
+        <w:t>B) Dt 9910 - Kt 4010</w:t>
       </w:r>
     </w:p>
     <w:p>
@@ -1718,7 +1709,7 @@
         <w:ind w:left="288"/>
       </w:pPr>
       <w:r>
-        <w:t>C) Dt 9910 - Kt 4010</w:t>
+        <w:t>C) Dt 4010 - Kt 9430</w:t>
       </w:r>
     </w:p>
     <w:p>
@@ -1727,7 +1718,7 @@
         <w:ind w:left="288"/>
       </w:pPr>
       <w:r>
-        <w:t>D) Dt 4910 - Kt 4010</w:t>
+        <w:t>D) Dt 9430 - Kt 4010</w:t>
       </w:r>
     </w:p>
     <w:p>
@@ -1738,8 +1729,7 @@
         <w:rPr>
           <w:b/>
         </w:rPr>
-        <w:lastRenderedPageBreak/>
-        <w:t>8. Hisobdor shaxsga xizmat safari uchun kassan naqd pul berilganda:</w:t>
+        <w:t>8. Hisobdor shaxsga xizmat safari uchun kassadan naqd pul berilganda:</w:t>
       </w:r>
     </w:p>
     <w:p>
@@ -1748,7 +1738,7 @@
         <w:ind w:left="288"/>
       </w:pPr>
       <w:r>
-        <w:t>A) Dt 4210 - Kt 5010</w:t>
+        <w:t>A) Dt 5010 - Kt 4210</w:t>
       </w:r>
     </w:p>
     <w:p>
@@ -1757,7 +1747,7 @@
         <w:ind w:left="288"/>
       </w:pPr>
       <w:r>
-        <w:t>B) Dt 5010 - Kt 4210</w:t>
+        <w:t>B) Dt 4210 - Kt 5010</w:t>
       </w:r>
     </w:p>
     <w:p>
@@ -1766,7 +1756,7 @@
         <w:ind w:left="288"/>
       </w:pPr>
       <w:r>
-        <w:t>C) Dt 6710 - Kt 5010</w:t>
+        <w:t>C) Dt 4210 - Kt 5110</w:t>
       </w:r>
     </w:p>
     <w:p>
@@ -1775,7 +1765,7 @@
         <w:ind w:left="288"/>
       </w:pPr>
       <w:r>
-        <w:t>D) Dt 4210 - Kt 5110</w:t>
+        <w:t>D) Dt 6710 - Kt 5010</w:t>
       </w:r>
     </w:p>
     <w:p>
@@ -1810,7 +1800,7 @@
         <w:ind w:left="288"/>
       </w:pPr>
       <w:r>
-        <w:t>B) Dt 5010 - Kt 4210</w:t>
+        <w:t>B) Dt 5110 - Kt 4210</w:t>
       </w:r>
     </w:p>
     <w:p>
@@ -1819,7 +1809,7 @@
         <w:ind w:left="288"/>
       </w:pPr>
       <w:r>
-        <w:t>C) Dt 5110 - Kt 4210</w:t>
+        <w:t>C) Dt 5010 - Kt 4210</w:t>
       </w:r>
     </w:p>
     <w:p>
@@ -1828,7 +1818,7 @@
         <w:ind w:left="288"/>
       </w:pPr>
       <w:r>
-        <w:t>D) Dt 9430 - Kt 4210</w:t>
+        <w:t>D) Dt 9420 - Kt 4210</w:t>
       </w:r>
     </w:p>
     <w:p>
@@ -1857,7 +1847,7 @@
         <w:ind w:left="288"/>
       </w:pPr>
       <w:r>
-        <w:t>B) Dt 9010 - Kt 6410</w:t>
+        <w:t>B) Dt 6410 - Kt 4010</w:t>
       </w:r>
     </w:p>
     <w:p>
@@ -1875,7 +1865,7 @@
         <w:ind w:left="288"/>
       </w:pPr>
       <w:r>
-        <w:t>D) Dt 6410 - Kt 4010</w:t>
+        <w:t>D) Dt 4010 - Kt 4410</w:t>
       </w:r>
     </w:p>
     <w:p>
@@ -1895,7 +1885,6 @@
           <w:color w:val="1F4E79"/>
           <w:sz w:val="28"/>
         </w:rPr>
-        <w:lastRenderedPageBreak/>
         <w:t xml:space="preserve">2-QISM: </w:t>
       </w:r>
       <w:r>
@@ -1905,7 +1894,7 @@
           <w:color w:val="1F4E79"/>
           <w:sz w:val="28"/>
         </w:rPr>
-        <w:t>YECHIMLAR VA JAVOBLAR (O'qituvchi uchun)</w:t>
+        <w:t>YECHIMLAR VA JAVOBLAR (o'qituvchi uchun)</w:t>
       </w:r>
     </w:p>
     <w:p>
@@ -2267,7 +2256,7 @@
           </w:tcPr>
           <w:p>
             <w:r>
-              <w:t>Sotilgan mahsulotning tan narxini hisobdan chiqarish</w:t>
+              <w:t>Sotilgan mahsulotning tannarxini hisobdan chiqarish</w:t>
             </w:r>
           </w:p>
         </w:tc>
@@ -2582,6 +2571,91 @@
           <w:p>
             <w:r>
               <w:t>8 000 000</w:t>
+            </w:r>
+          </w:p>
+        </w:tc>
+      </w:tr>
+      <w:tr>
+        <w:trPr>
+          <w:jc w:val="center"/>
+        </w:trPr>
+        <w:tc>
+          <w:tcPr>
+            <w:tcW w:w="720" w:type="dxa"/>
+            <w:tcMar>
+              <w:top w:w="60" w:type="dxa"/>
+              <w:left w:w="80" w:type="dxa"/>
+              <w:bottom w:w="60" w:type="dxa"/>
+              <w:right w:w="80" w:type="dxa"/>
+            </w:tcMar>
+          </w:tcPr>
+          <w:p>
+            <w:r>
+              <w:t>5</w:t>
+            </w:r>
+          </w:p>
+        </w:tc>
+        <w:tc>
+          <w:tcPr>
+            <w:tcW w:w="4608" w:type="dxa"/>
+            <w:tcMar>
+              <w:top w:w="60" w:type="dxa"/>
+              <w:left w:w="80" w:type="dxa"/>
+              <w:bottom w:w="60" w:type="dxa"/>
+              <w:right w:w="80" w:type="dxa"/>
+            </w:tcMar>
+          </w:tcPr>
+          <w:p>
+            <w:r>
+              <w:t>Xizmat safari bo'yicha avans hisoboti tasdiqlandi (xarajatlar ma'muriy xarajatlarga olindi)</w:t>
+            </w:r>
+          </w:p>
+        </w:tc>
+        <w:tc>
+          <w:tcPr>
+            <w:tcW w:w="1152" w:type="dxa"/>
+            <w:tcMar>
+              <w:top w:w="60" w:type="dxa"/>
+              <w:left w:w="80" w:type="dxa"/>
+              <w:bottom w:w="60" w:type="dxa"/>
+              <w:right w:w="80" w:type="dxa"/>
+            </w:tcMar>
+          </w:tcPr>
+          <w:p>
+            <w:r>
+              <w:t>9420</w:t>
+            </w:r>
+          </w:p>
+        </w:tc>
+        <w:tc>
+          <w:tcPr>
+            <w:tcW w:w="1152" w:type="dxa"/>
+            <w:tcMar>
+              <w:top w:w="60" w:type="dxa"/>
+              <w:left w:w="80" w:type="dxa"/>
+              <w:bottom w:w="60" w:type="dxa"/>
+              <w:right w:w="80" w:type="dxa"/>
+            </w:tcMar>
+          </w:tcPr>
+          <w:p>
+            <w:r>
+              <w:t>4210</w:t>
+            </w:r>
+          </w:p>
+        </w:tc>
+        <w:tc>
+          <w:tcPr>
+            <w:tcW w:w="1728" w:type="dxa"/>
+            <w:tcMar>
+              <w:top w:w="60" w:type="dxa"/>
+              <w:left w:w="80" w:type="dxa"/>
+              <w:bottom w:w="60" w:type="dxa"/>
+              <w:right w:w="80" w:type="dxa"/>
+            </w:tcMar>
+          </w:tcPr>
+          <w:p>
+            <w:r>
+              <w:t>3 000 000</w:t>
             </w:r>
           </w:p>
         </w:tc>
@@ -3123,33 +3197,263 @@
         <w:rPr>
           <w:b/>
         </w:rPr>
-        <w:t>2-bo'lim (Nazariy testlar) javoblari:</w:t>
+        <w:t>2-bo'lim (nazariy testlar) javoblari:</w:t>
       </w:r>
     </w:p>
     <w:p>
       <w:pPr>
         <w:spacing w:after="80"/>
         <w:ind w:left="288"/>
-      </w:pPr>
-      <w:r>
-        <w:t>1-B, 2-C, 3-B, 4-C (3 yil), 5-A (4910), 6-B (4210), 7-C (9430), 8-B (Joriy aktivlar), 9-B, 10-B (Da'vo muddatini uzadi).</w:t>
-      </w:r>
-    </w:p>
-    <w:p>
-      <w:pPr>
-        <w:spacing w:after="40"/>
       </w:pPr>
       <w:r>
         <w:rPr>
           <w:b/>
         </w:rPr>
-        <w:t>7-bo'lim (Provod</w:t>
-      </w:r>
+        <w:t>1-savol. To'g'ri javob: A) Boshqalarning korxonaga bo'lgan qarzi</w:t>
+      </w:r>
+    </w:p>
+    <w:p>
+      <w:pPr>
+        <w:spacing w:after="80"/>
+        <w:ind w:left="288"/>
+      </w:pPr>
+      <w:r>
+        <w:rPr>
+          <w:b w:val="0"/>
+        </w:rPr>
+        <w:t>Tushuntirish: Debitorlik qarzi — uchinchi shaxslarning (xaridorlar, hisobdor shaxslar, mol yetkazib beruvchilarga berilgan bo'naklar va b.) korxonaga to'lashi kerak bo'lgan qarzi; u joriy aktiv hisoblanadi. Korxonaning boshqalarga qarzi — kreditorlik qarzi, eng ko'p adashtiriladigan tushuncha. Bank krediti — majburiyat, kelgusi davr xarajatlari esa alohida aktiv moddasi.</w:t>
+      </w:r>
+    </w:p>
+    <w:p>
+      <w:pPr>
+        <w:spacing w:after="80"/>
+        <w:ind w:left="288"/>
+      </w:pPr>
       <w:r>
         <w:rPr>
           <w:b/>
         </w:rPr>
-        <w:t>ka testlari) javoblari:</w:t>
+        <w:t>2-savol. To'g'ri javob: D) 4010-schyot</w:t>
+      </w:r>
+    </w:p>
+    <w:p>
+      <w:pPr>
+        <w:spacing w:after="80"/>
+        <w:ind w:left="288"/>
+      </w:pPr>
+      <w:r>
+        <w:rPr>
+          <w:b w:val="0"/>
+        </w:rPr>
+        <w:t>Tushuntirish: Mahsulot sotilganda xaridorning korxonaga qarzi paydo bo'ladi va 4010 «Xaridorlar va buyurtmachilardan olinadigan schyotlar» debetlanadi: Dt 4010 Kt 9010. 9010 bu operatsiyada kreditlanadi (daromad), 6010 — mol yetkazib beruvchilarga qarz, 4310 — berilgan bo'naklar.</w:t>
+      </w:r>
+    </w:p>
+    <w:p>
+      <w:pPr>
+        <w:spacing w:after="80"/>
+        <w:ind w:left="288"/>
+      </w:pPr>
+      <w:r>
+        <w:rPr>
+          <w:b/>
+        </w:rPr>
+        <w:t>3-savol. To'g'ri javob: B) 4310-schyot</w:t>
+      </w:r>
+    </w:p>
+    <w:p>
+      <w:pPr>
+        <w:spacing w:after="80"/>
+        <w:ind w:left="288"/>
+      </w:pPr>
+      <w:r>
+        <w:rPr>
+          <w:b w:val="0"/>
+        </w:rPr>
+        <w:t>Tushuntirish: Mol yetkazib beruvchiga oldindan o'tkazilgan bo'nak korxonaning aktivi — 4310 «Berilgan bo'naklar» schyotida hisobga olinadi. 6310 — xaridorlardan olingan bo'naklar (majburiyat), talabalar ko'pincha shu ikkisini adashtiradi. 4010 xaridorlar qarzi, 6010 esa mol yetkazib beruvchilarga korxonaning qarzi.</w:t>
+      </w:r>
+    </w:p>
+    <w:p>
+      <w:pPr>
+        <w:spacing w:after="80"/>
+        <w:ind w:left="288"/>
+      </w:pPr>
+      <w:r>
+        <w:rPr>
+          <w:b/>
+        </w:rPr>
+        <w:t>4-savol. To'g'ri javob: C) Uch yil</w:t>
+      </w:r>
+    </w:p>
+    <w:p>
+      <w:pPr>
+        <w:spacing w:after="80"/>
+        <w:ind w:left="288"/>
+      </w:pPr>
+      <w:r>
+        <w:rPr>
+          <w:b w:val="0"/>
+        </w:rPr>
+        <w:t>Tushuntirish: Fuqarolik kodeksining 150-moddasiga ko'ra umumiy da'vo muddati uch yil. Besh yil ko'pincha hujjatlarni saqlash muddati bilan adashtiriladi; bir yil va o'n yil umumiy da'vo muddati emas.</w:t>
+      </w:r>
+    </w:p>
+    <w:p>
+      <w:pPr>
+        <w:spacing w:after="80"/>
+        <w:ind w:left="288"/>
+      </w:pPr>
+      <w:r>
+        <w:rPr>
+          <w:b/>
+        </w:rPr>
+        <w:t>5-savol. To'g'ri javob: D) 4910-schyot</w:t>
+      </w:r>
+    </w:p>
+    <w:p>
+      <w:pPr>
+        <w:spacing w:after="80"/>
+        <w:ind w:left="288"/>
+      </w:pPr>
+      <w:r>
+        <w:rPr>
+          <w:b w:val="0"/>
+        </w:rPr>
+        <w:t>Tushuntirish: Shubhali qarzlar bo'yicha zaxira 4910 kontr-aktiv schyotida yaratiladi va balansda debitorlik qarzini sof qiymatda ko'rsatadi. 8910 — kelgusi xarajatlar va to'lovlar zaxirasi (passiv), 9430 — zaxira yaratishda debetlanadigan xarajat schyoti, 4010 — qarzning o'zi.</w:t>
+      </w:r>
+    </w:p>
+    <w:p>
+      <w:pPr>
+        <w:spacing w:after="80"/>
+        <w:ind w:left="288"/>
+      </w:pPr>
+      <w:r>
+        <w:rPr>
+          <w:b/>
+        </w:rPr>
+        <w:t>6-savol. To'g'ri javob: B) 4210-schyot</w:t>
+      </w:r>
+    </w:p>
+    <w:p>
+      <w:pPr>
+        <w:spacing w:after="80"/>
+        <w:ind w:left="288"/>
+      </w:pPr>
+      <w:r>
+        <w:rPr>
+          <w:b w:val="0"/>
+        </w:rPr>
+        <w:t>Tushuntirish: Xizmat safari va xo'jalik ehtiyojlari uchun berilgan pul hisobdor shaxsning korxonaga qarzi bo'lib, 4210 schyotida hisobga olinadi. 4710 — xodimlarning boshqa operatsiyalar (masalan, moddiy zarar) bo'yicha qarzi, 6710 — korxonaning xodimlarga ish haqi bo'yicha qarzi, 4310 — mol yetkazib beruvchilarga bo'naklar.</w:t>
+      </w:r>
+    </w:p>
+    <w:p>
+      <w:pPr>
+        <w:spacing w:after="80"/>
+        <w:ind w:left="288"/>
+      </w:pPr>
+      <w:r>
+        <w:rPr>
+          <w:b/>
+        </w:rPr>
+        <w:t>7-savol. To'g'ri javob: A) 9430-schyot</w:t>
+      </w:r>
+    </w:p>
+    <w:p>
+      <w:pPr>
+        <w:spacing w:after="80"/>
+        <w:ind w:left="288"/>
+      </w:pPr>
+      <w:r>
+        <w:rPr>
+          <w:b w:val="0"/>
+        </w:rPr>
+        <w:t>Tushuntirish: Zaxira tashkil etilmagan bo'lsa, umidsiz qarz boshqa operatsion xarajat sifatida hisobdan chiqariladi: Dt 9430 Kt 4010. 4910 faqat zaxira mavjud bo'lganda ishlatiladi; 9420 — ma'muriy xarajatlar, 9910 — yakuniy moliyaviy natija schyoti.</w:t>
+      </w:r>
+    </w:p>
+    <w:p>
+      <w:pPr>
+        <w:spacing w:after="80"/>
+        <w:ind w:left="288"/>
+      </w:pPr>
+      <w:r>
+        <w:rPr>
+          <w:b/>
+        </w:rPr>
+        <w:t>8-savol. To'g'ri javob: C) Joriy aktivlar bo'limida</w:t>
+      </w:r>
+    </w:p>
+    <w:p>
+      <w:pPr>
+        <w:spacing w:after="80"/>
+        <w:ind w:left="288"/>
+      </w:pPr>
+      <w:r>
+        <w:rPr>
+          <w:b w:val="0"/>
+        </w:rPr>
+        <w:t>Tushuntirish: Xaridorlar qarzi odatda 12 oy ichida pulga aylanadi, shuning uchun 4010 balansning joriy aktivlar bo'limida ko'rsatiladi. Joriy majburiyatlar — kreditorlik qarzi (6010, 6310) joyi; uzoq muddatli aktivlar va xususiy kapital debitorlik qarziga taalluqli emas.</w:t>
+      </w:r>
+    </w:p>
+    <w:p>
+      <w:pPr>
+        <w:spacing w:after="80"/>
+        <w:ind w:left="288"/>
+      </w:pPr>
+      <w:r>
+        <w:rPr>
+          <w:b/>
+        </w:rPr>
+        <w:t>9-savol. To'g'ri javob: B) Sud yoki davlat ijrochisi hujjati</w:t>
+      </w:r>
+    </w:p>
+    <w:p>
+      <w:pPr>
+        <w:spacing w:after="80"/>
+        <w:ind w:left="288"/>
+      </w:pPr>
+      <w:r>
+        <w:rPr>
+          <w:b w:val="0"/>
+        </w:rPr>
+        <w:t>Tushuntirish: Qarzni undirish imkonsiz deb topish uchun tashqi tasdiqlovchi hujjat — sud qarori yoki davlat ijrochisining undirish imkonsizligi haqidagi dalolatnomasi (yoki qarzdor tugatilgani haqida ma'lumot) kerak. Rahbar buyrug'i bu hujjat asosida chiqariladi, lekin yolg'iz o'zi yetarli emas; bank ma'lumotnomasi va og'zaki kelishuv asos bo'lmaydi.</w:t>
+      </w:r>
+    </w:p>
+    <w:p>
+      <w:pPr>
+        <w:spacing w:after="80"/>
+        <w:ind w:left="288"/>
+      </w:pPr>
+      <w:r>
+        <w:rPr>
+          <w:b/>
+        </w:rPr>
+        <w:t>10-savol. To'g'ri javob: D) Da'vo muddatini uzib, qayta boshlaydi</w:t>
+      </w:r>
+    </w:p>
+    <w:p>
+      <w:pPr>
+        <w:spacing w:after="80"/>
+        <w:ind w:left="288"/>
+      </w:pPr>
+      <w:r>
+        <w:rPr>
+          <w:b w:val="0"/>
+        </w:rPr>
+        <w:t>Tushuntirish: Qarzdor solishtirish dalolatnomasini imzolab, qarzni tan olsa, da'vo muddati uziladi va uch yillik muddat qaytadan boshlanadi (1-keys yechimiga qarang). Muddat bir yilga uzaymaydi va qarz hisobdan chiqmaydi — aksincha, dalolatnoma qarzni undirish huquqini saqlab qoladi.</w:t>
+      </w:r>
+    </w:p>
+    <w:p>
+      <w:pPr>
+        <w:spacing w:after="40"/>
+      </w:pPr>
+      <w:r>
+        <w:rPr>
+          <w:b/>
+        </w:rPr>
+        <w:t>7-bo'lim (provodka testlari) javoblari:</w:t>
+      </w:r>
+      <w:r>
+        <w:rPr>
+          <w:b/>
+        </w:rPr>
       </w:r>
     </w:p>
     <w:p>
@@ -3158,7 +3462,238 @@
         <w:ind w:left="288"/>
       </w:pPr>
       <w:r>
-        <w:t>1-A (Dt 4010 Kt 9010), 2-B (Dt 5110 Kt 4010), 3-B (Dt 4310 Kt 5110), 4-A (Dt 6010 Kt 4310), 5-A (Dt 9430 Kt 4910), 6-B (Dt 4910 Kt 4010), 7-A (Dt 9430 Kt 4010), 8-A (Dt 4210 Kt 5010), 9-B (Dt 5010 Kt 4210), 10-B (Dt 9010 Kt 6410).</w:t>
+        <w:rPr>
+          <w:b/>
+        </w:rPr>
+        <w:t>1-savol. To'g'ri javob: C) Dt 4010 - Kt 9010</w:t>
+      </w:r>
+    </w:p>
+    <w:p>
+      <w:pPr>
+        <w:spacing w:after="120"/>
+        <w:ind w:left="288"/>
+      </w:pPr>
+      <w:r>
+        <w:rPr>
+          <w:b w:val="0"/>
+        </w:rPr>
+        <w:t>Tushuntirish: Mahsulot nasiyaga sotilganda xaridorning qarzi (4010) paydo bo'ladi va sotishdan daromad (9010) tan olinadi: Dt 4010 Kt 9010. Dt 5110 Kt 9010 — pul darhol kelgandagi yozuv, teskari yozuv daromadni kamaytiradi, 6010 esa mol yetkazib beruvchilar schyoti.</w:t>
+      </w:r>
+    </w:p>
+    <w:p>
+      <w:pPr>
+        <w:spacing w:after="120"/>
+        <w:ind w:left="288"/>
+      </w:pPr>
+      <w:r>
+        <w:rPr>
+          <w:b/>
+        </w:rPr>
+        <w:t>2-savol. To'g'ri javob: A) Dt 5110 - Kt 4010</w:t>
+      </w:r>
+    </w:p>
+    <w:p>
+      <w:pPr>
+        <w:spacing w:after="120"/>
+        <w:ind w:left="288"/>
+      </w:pPr>
+      <w:r>
+        <w:rPr>
+          <w:b w:val="0"/>
+        </w:rPr>
+        <w:t>Tushuntirish: Ilgari sotilgan mahsulot uchun pul kelganda bankdagi pul oshadi va xaridorning qarzi yopiladi: Dt 5110 Kt 4010. Dt 5110 Kt 9010 daromadni ikkinchi marta tan oladi; Dt 5110 Kt 6310 — mahsulot hali yetkazilmagan bo'lsa, olingan bo'nak uchun ishlatiladi.</w:t>
+      </w:r>
+    </w:p>
+    <w:p>
+      <w:pPr>
+        <w:spacing w:after="120"/>
+        <w:ind w:left="288"/>
+      </w:pPr>
+      <w:r>
+        <w:rPr>
+          <w:b/>
+        </w:rPr>
+        <w:t>3-savol. To'g'ri javob: D) Dt 4310 - Kt 5110</w:t>
+      </w:r>
+    </w:p>
+    <w:p>
+      <w:pPr>
+        <w:spacing w:after="120"/>
+        <w:ind w:left="288"/>
+      </w:pPr>
+      <w:r>
+        <w:rPr>
+          <w:b w:val="0"/>
+        </w:rPr>
+        <w:t>Tushuntirish: Mol yetkazib beruvchiga oldindan to'langan bo'nak korxonaning aktivi sifatida 4310 da aks etadi: Dt 4310 Kt 5110. Dt 6010 Kt 5110 — eng ko'p uchraydigan xato: u material hali kelmagan bo'lsa ham qarzni yopilgan deb ko'rsatadi; 6310 esa xaridorlardan olingan bo'naklar.</w:t>
+      </w:r>
+    </w:p>
+    <w:p>
+      <w:pPr>
+        <w:spacing w:after="120"/>
+        <w:ind w:left="288"/>
+      </w:pPr>
+      <w:r>
+        <w:rPr>
+          <w:b/>
+        </w:rPr>
+        <w:t>4-savol. To'g'ri javob: B) Dt 6010 - Kt 4310</w:t>
+      </w:r>
+    </w:p>
+    <w:p>
+      <w:pPr>
+        <w:spacing w:after="120"/>
+        <w:ind w:left="288"/>
+      </w:pPr>
+      <w:r>
+        <w:rPr>
+          <w:b w:val="0"/>
+        </w:rPr>
+        <w:t>Tushuntirish: Materiallar kelganda avval kirim qilinadi (Dt 1010 Kt 6010), so'ng ilgari berilgan bo'nak mol yetkazib beruvchiga qarz hisobiga o'tkaziladi: Dt 6010 Kt 4310. Dt 1010 Kt 4310 qisqartirilgan, lekin noto'g'ri yozuv — u 6010 bo'yicha hisob-kitobni chetlab o'tadi.</w:t>
+      </w:r>
+    </w:p>
+    <w:p>
+      <w:pPr>
+        <w:spacing w:after="120"/>
+        <w:ind w:left="288"/>
+      </w:pPr>
+      <w:r>
+        <w:rPr>
+          <w:b/>
+        </w:rPr>
+        <w:t>5-savol. To'g'ri javob: A) Dt 9430 - Kt 4910</w:t>
+      </w:r>
+    </w:p>
+    <w:p>
+      <w:pPr>
+        <w:spacing w:after="120"/>
+        <w:ind w:left="288"/>
+      </w:pPr>
+      <w:r>
+        <w:rPr>
+          <w:b w:val="0"/>
+        </w:rPr>
+        <w:t>Tushuntirish: Zaxira yaratilganda ehtimoliy yo'qotish xarajatga olinadi (9430) va kontr-aktiv 4910 kreditlanadi: Dt 9430 Kt 4910. Dt 9430 Kt 4010 — zaxirasiz hisobdan chiqarish, Dt 4910 Kt 4010 — zaxira hisobidan chiqarish; ular keyingi bosqichdagi yozuvlar.</w:t>
+      </w:r>
+    </w:p>
+    <w:p>
+      <w:pPr>
+        <w:spacing w:after="120"/>
+        <w:ind w:left="288"/>
+      </w:pPr>
+      <w:r>
+        <w:rPr>
+          <w:b/>
+        </w:rPr>
+        <w:t>6-savol. To'g'ri javob: C) Dt 4910 - Kt 4010</w:t>
+      </w:r>
+    </w:p>
+    <w:p>
+      <w:pPr>
+        <w:spacing w:after="120"/>
+        <w:ind w:left="288"/>
+      </w:pPr>
+      <w:r>
+        <w:rPr>
+          <w:b w:val="0"/>
+        </w:rPr>
+        <w:t>Tushuntirish: Zaxira ilgari yaratilgan bo'lsa, umidsiz qarz shu zaxira hisobidan yopiladi: Dt 4910 Kt 4010 — xarajat qayta tan olinmaydi. Dt 9430 Kt 4010 zaxira bo'lmaganda ishlatiladi; Dt 9430 Kt 4910 — zaxirani yaratish yozuvi.</w:t>
+      </w:r>
+    </w:p>
+    <w:p>
+      <w:pPr>
+        <w:spacing w:after="120"/>
+        <w:ind w:left="288"/>
+      </w:pPr>
+      <w:r>
+        <w:rPr>
+          <w:b/>
+        </w:rPr>
+        <w:t>7-savol. To'g'ri javob: D) Dt 9430 - Kt 4010</w:t>
+      </w:r>
+    </w:p>
+    <w:p>
+      <w:pPr>
+        <w:spacing w:after="120"/>
+        <w:ind w:left="288"/>
+      </w:pPr>
+      <w:r>
+        <w:rPr>
+          <w:b w:val="0"/>
+        </w:rPr>
+        <w:t>Tushuntirish: Zaxira bo'lmasa, umidsiz qarz to'g'ridan-to'g'ri boshqa operatsion xarajatga olinadi: Dt 9430 Kt 4010. 4910 zaxira bo'lmagani uchun ishlatilmaydi, 9910 — yil oxirida moliyaviy natijani aniqlash schyoti, teskari yozuv esa qarzni oshiradi.</w:t>
+      </w:r>
+    </w:p>
+    <w:p>
+      <w:pPr>
+        <w:spacing w:after="120"/>
+        <w:ind w:left="288"/>
+      </w:pPr>
+      <w:r>
+        <w:rPr>
+          <w:b/>
+        </w:rPr>
+        <w:t>8-savol. To'g'ri javob: B) Dt 4210 - Kt 5010</w:t>
+      </w:r>
+    </w:p>
+    <w:p>
+      <w:pPr>
+        <w:spacing w:after="120"/>
+        <w:ind w:left="288"/>
+      </w:pPr>
+      <w:r>
+        <w:rPr>
+          <w:b w:val="0"/>
+        </w:rPr>
+        <w:t>Tushuntirish: Kassadan naqd pul berilganda hisobdor shaxsning qarzi (4210) paydo bo'ladi va kassa (5010) kamayadi: Dt 4210 Kt 5010. Dt 4210 Kt 5110 — pul bank kartasiga o'tkazilgandagi yozuv; Dt 6710 Kt 5010 — ish haqi to'lash, safar avansi emas.</w:t>
+      </w:r>
+    </w:p>
+    <w:p>
+      <w:pPr>
+        <w:spacing w:after="120"/>
+        <w:ind w:left="288"/>
+      </w:pPr>
+      <w:r>
+        <w:rPr>
+          <w:b/>
+        </w:rPr>
+        <w:t>9-savol. To'g'ri javob: C) Dt 5010 - Kt 4210</w:t>
+      </w:r>
+    </w:p>
+    <w:p>
+      <w:pPr>
+        <w:spacing w:after="120"/>
+        <w:ind w:left="288"/>
+      </w:pPr>
+      <w:r>
+        <w:rPr>
+          <w:b w:val="0"/>
+        </w:rPr>
+        <w:t>Tushuntirish: Foydalanilmagan avans kassaga qaytarilganda kassa oshadi va hisobdor shaxsning qarzi kamayadi: Dt 5010 Kt 4210. Dt 9420 Kt 4210 — avans hisoboti bo'yicha sarflangan summani xarajatga olish; Dt 5110 Kt 4210 — pul bankka qaytarilgandagi yozuv.</w:t>
+      </w:r>
+    </w:p>
+    <w:p>
+      <w:pPr>
+        <w:spacing w:after="120"/>
+        <w:ind w:left="288"/>
+      </w:pPr>
+      <w:r>
+        <w:rPr>
+          <w:b/>
+        </w:rPr>
+        <w:t>10-savol. To'g'ri javob: A) Dt 4010 - Kt 6410</w:t>
+      </w:r>
+    </w:p>
+    <w:p>
+      <w:pPr>
+        <w:spacing w:after="120"/>
+        <w:ind w:left="288"/>
+      </w:pPr>
+      <w:r>
+        <w:rPr>
+          <w:b w:val="0"/>
+        </w:rPr>
+        <w:t>Tushuntirish: Ushbu majmuada sotish tushumi QQSsiz Dt 4010 Kt 9010 bilan, QQS esa alohida Dt 4010 Kt 6410 bilan aks ettiriladi (ko'rgazmali masala yechimidagi 1b-provodka). Xaridor QQS bilan birga to'laydi, shuning uchun uning qarzi oshadi, byudjet oldidagi majburiyat ham oshadi. Dt 4410 Kt 6010 — xarid qilinganda to'lanadigan (kirish) QQS, 4410 ni sotishda kreditlash esa noto'g'ri.</w:t>
       </w:r>
     </w:p>
     <w:p>
@@ -3182,7 +3717,7 @@
           <w:color w:val="2E75B6"/>
           <w:sz w:val="24"/>
         </w:rPr>
-        <w:t>. Qisqa mashqlar va Atamalar mosligi kaliti</w:t>
+        <w:t>. Qisqa mashqlar va atamalar mosligi kaliti</w:t>
       </w:r>
     </w:p>
     <w:p>
@@ -3220,7 +3755,7 @@
         <w:t xml:space="preserve">• 2-MASHQ Yechimi: </w:t>
       </w:r>
       <w:r>
-        <w:t>Jarima summasi = 10 * 440 000 so'm = 4 400 000 so'm.</w:t>
+        <w:t>Jarima summasi = 10 × 440 000 so'm = 4 400 000 so'm.</w:t>
       </w:r>
     </w:p>
     <w:p>
@@ -3253,7 +3788,7 @@
         <w:t xml:space="preserve">• 4-MASHQ Yechimi: </w:t>
       </w:r>
       <w:r>
-        <w:t>QQS summasi = 100 000 000 * 12% = 12 000 000 so'm. Umumiy debitorlik qarzi (4010) = 112 000 000 so'm.</w:t>
+        <w:t>QQS summasi = 100 000 000 × 12% = 12 000 000 so'm. Umumiy debitorlik qarzi (4010) = 112 000 000 so'm.</w:t>
       </w:r>
     </w:p>
     <w:p>
@@ -3286,7 +3821,7 @@
           <w:color w:val="2E75B6"/>
           <w:sz w:val="24"/>
         </w:rPr>
-        <w:t>4. Amaliy masalalar va Keyslar yechimlari</w:t>
+        <w:t>4. Amaliy masalalar va keyslar yechimlari</w:t>
       </w:r>
     </w:p>
     <w:p>
@@ -3301,7 +3836,7 @@
         <w:t xml:space="preserve">• 1-MASALA Yechimi: </w:t>
       </w:r>
       <w:r>
-        <w:t>1) Dt 4010 Kt 9010 = 75 000 000 (sotish tushumi); 2) Dt 4010 Kt 6410 = 9 000 000 (QQS); 3) Dt 9110 Kt 2810 = 60 000 000 (tan narx); 4) Dt 5110 Kt 4010 = 50 000 000 (pul kelib tushishi)</w:t>
+        <w:t>1) Dt 4010 Kt 9010 = 75 000 000 (sotish tushumi); 2) Dt 4010 Kt 6410 = 9 000 000 (QQS); 3) Dt 9110 Kt 2810 = 60 000 000 (tannarx); 4) Dt 5110 Kt 4010 = 50 000 000 (pul kelib tushishi)</w:t>
       </w:r>
       <w:r>
         <w:t>.</w:t>
@@ -3352,7 +3887,7 @@
         <w:t xml:space="preserve">• 1-KEYS Yechimi: </w:t>
       </w:r>
       <w:r>
-        <w:t>Da'vo muddati (3 yil) tugashiga 6 oy qolganda shoshilinch ravishda 'Zilola' MChJ bilan akt sverki imzolanishi yoki qarzdorlikni qisman to'latish lozim. Bu Fuqarolik Kodeksining 157-</w:t>
+        <w:t>Da'vo muddati (3 yil) tugashiga 6 oy qolganda shoshilinch ravishda 'Zilola' MChJ bilan akt sverki imzolanishi yoki qarzdorlikni qisman to'latish lozim. Bu Fuqarolik kodeksining 157-</w:t>
       </w:r>
       <w:r>
         <w:t>moddasiga ko'ra da'vo muddatini uzib, qayta 3 yilga uzaytiradi. Aks holda sud da'voni rad etishi mumkin.</w:t>

</xml_diff>